<commit_message>
Update DOCX attachment for improved travel plan generation
</commit_message>
<xml_diff>
--- a/templates/smartherz-memorandum.docx
+++ b/templates/smartherz-memorandum.docx
@@ -12,7 +12,12 @@
       </w:pPr>
     </w:p>
     <w:sectPr>
-      <w:headerReference w:type="default" r:id="rId7"/>
+      <w:headerReference w:type="even" r:id="rId7"/>
+      <w:headerReference w:type="default" r:id="rId8"/>
+      <w:footerReference w:type="even" r:id="rId9"/>
+      <w:footerReference w:type="default" r:id="rId10"/>
+      <w:headerReference w:type="first" r:id="rId11"/>
+      <w:footerReference w:type="first" r:id="rId12"/>
       <w:pgSz w:w="11906" w:h="16838" w:code="9"/>
       <w:pgMar w:top="1440" w:right="1440" w:bottom="2160" w:left="1440" w:header="720" w:footer="720" w:gutter="0"/>
       <w:cols w:space="720"/>
@@ -47,6 +52,36 @@
 </w:endnotes>
 </file>
 
+<file path=word/footer1.xml><?xml version="1.0" encoding="utf-8"?>
+<w:ftr xmlns:wpc="http://schemas.microsoft.com/office/word/2010/wordprocessingCanvas" xmlns:cx="http://schemas.microsoft.com/office/drawing/2014/chartex" xmlns:cx1="http://schemas.microsoft.com/office/drawing/2015/9/8/chartex" xmlns:cx2="http://schemas.microsoft.com/office/drawing/2015/10/21/chartex" xmlns:cx3="http://schemas.microsoft.com/office/drawing/2016/5/9/chartex" xmlns:cx4="http://schemas.microsoft.com/office/drawing/2016/5/10/chartex" xmlns:cx5="http://schemas.microsoft.com/office/drawing/2016/5/11/chartex" xmlns:cx6="http://schemas.microsoft.com/office/drawing/2016/5/12/chartex" xmlns:cx7="http://schemas.microsoft.com/office/drawing/2016/5/13/chartex" xmlns:cx8="http://schemas.microsoft.com/office/drawing/2016/5/14/chartex" xmlns:mc="http://schemas.openxmlformats.org/markup-compatibility/2006" xmlns:aink="http://schemas.microsoft.com/office/drawing/2016/ink" xmlns:am3d="http://schemas.microsoft.com/office/drawing/2017/model3d" xmlns:o="urn:schemas-microsoft-com:office:office" xmlns:oel="http://schemas.microsoft.com/office/2019/extlst" xmlns:r="http://schemas.openxmlformats.org/officeDocument/2006/relationships" xmlns:m="http://schemas.openxmlformats.org/officeDocument/2006/math" xmlns:v="urn:schemas-microsoft-com:vml" xmlns:wp14="http://schemas.microsoft.com/office/word/2010/wordprocessingDrawing" xmlns:wp="http://schemas.openxmlformats.org/drawingml/2006/wordprocessingDrawing" xmlns:w10="urn:schemas-microsoft-com:office:word" xmlns:w="http://schemas.openxmlformats.org/wordprocessingml/2006/main" xmlns:w14="http://schemas.microsoft.com/office/word/2010/wordml" xmlns:w15="http://schemas.microsoft.com/office/word/2012/wordml" xmlns:w16cex="http://schemas.microsoft.com/office/word/2018/wordml/cex" xmlns:w16cid="http://schemas.microsoft.com/office/word/2016/wordml/cid" xmlns:w16="http://schemas.microsoft.com/office/word/2018/wordml" xmlns:w16du="http://schemas.microsoft.com/office/word/2023/wordml/word16du" xmlns:w16sdtdh="http://schemas.microsoft.com/office/word/2020/wordml/sdtdatahash" xmlns:w16sdtfl="http://schemas.microsoft.com/office/word/2024/wordml/sdtformatlock" xmlns:w16se="http://schemas.microsoft.com/office/word/2015/wordml/symex" xmlns:wpg="http://schemas.microsoft.com/office/word/2010/wordprocessingGroup" xmlns:wpi="http://schemas.microsoft.com/office/word/2010/wordprocessingInk" xmlns:wne="http://schemas.microsoft.com/office/word/2006/wordml" xmlns:wps="http://schemas.microsoft.com/office/word/2010/wordprocessingShape" mc:Ignorable="w14 w15 w16se w16cid w16 w16cex w16sdtdh w16sdtfl w16du wp14">
+  <w:p>
+    <w:pPr>
+      <w:pStyle w:val="Footer"/>
+    </w:pPr>
+  </w:p>
+</w:ftr>
+</file>
+
+<file path=word/footer2.xml><?xml version="1.0" encoding="utf-8"?>
+<w:ftr xmlns:wpc="http://schemas.microsoft.com/office/word/2010/wordprocessingCanvas" xmlns:cx="http://schemas.microsoft.com/office/drawing/2014/chartex" xmlns:cx1="http://schemas.microsoft.com/office/drawing/2015/9/8/chartex" xmlns:cx2="http://schemas.microsoft.com/office/drawing/2015/10/21/chartex" xmlns:cx3="http://schemas.microsoft.com/office/drawing/2016/5/9/chartex" xmlns:cx4="http://schemas.microsoft.com/office/drawing/2016/5/10/chartex" xmlns:cx5="http://schemas.microsoft.com/office/drawing/2016/5/11/chartex" xmlns:cx6="http://schemas.microsoft.com/office/drawing/2016/5/12/chartex" xmlns:cx7="http://schemas.microsoft.com/office/drawing/2016/5/13/chartex" xmlns:cx8="http://schemas.microsoft.com/office/drawing/2016/5/14/chartex" xmlns:mc="http://schemas.openxmlformats.org/markup-compatibility/2006" xmlns:aink="http://schemas.microsoft.com/office/drawing/2016/ink" xmlns:am3d="http://schemas.microsoft.com/office/drawing/2017/model3d" xmlns:o="urn:schemas-microsoft-com:office:office" xmlns:oel="http://schemas.microsoft.com/office/2019/extlst" xmlns:r="http://schemas.openxmlformats.org/officeDocument/2006/relationships" xmlns:m="http://schemas.openxmlformats.org/officeDocument/2006/math" xmlns:v="urn:schemas-microsoft-com:vml" xmlns:wp14="http://schemas.microsoft.com/office/word/2010/wordprocessingDrawing" xmlns:wp="http://schemas.openxmlformats.org/drawingml/2006/wordprocessingDrawing" xmlns:w10="urn:schemas-microsoft-com:office:word" xmlns:w="http://schemas.openxmlformats.org/wordprocessingml/2006/main" xmlns:w14="http://schemas.microsoft.com/office/word/2010/wordml" xmlns:w15="http://schemas.microsoft.com/office/word/2012/wordml" xmlns:w16cex="http://schemas.microsoft.com/office/word/2018/wordml/cex" xmlns:w16cid="http://schemas.microsoft.com/office/word/2016/wordml/cid" xmlns:w16="http://schemas.microsoft.com/office/word/2018/wordml" xmlns:w16du="http://schemas.microsoft.com/office/word/2023/wordml/word16du" xmlns:w16sdtdh="http://schemas.microsoft.com/office/word/2020/wordml/sdtdatahash" xmlns:w16sdtfl="http://schemas.microsoft.com/office/word/2024/wordml/sdtformatlock" xmlns:w16se="http://schemas.microsoft.com/office/word/2015/wordml/symex" xmlns:wpg="http://schemas.microsoft.com/office/word/2010/wordprocessingGroup" xmlns:wpi="http://schemas.microsoft.com/office/word/2010/wordprocessingInk" xmlns:wne="http://schemas.microsoft.com/office/word/2006/wordml" xmlns:wps="http://schemas.microsoft.com/office/word/2010/wordprocessingShape" mc:Ignorable="w14 w15 w16se w16cid w16 w16cex w16sdtdh w16sdtfl w16du wp14">
+  <w:p>
+    <w:pPr>
+      <w:pStyle w:val="Footer"/>
+    </w:pPr>
+  </w:p>
+</w:ftr>
+</file>
+
+<file path=word/footer3.xml><?xml version="1.0" encoding="utf-8"?>
+<w:ftr xmlns:wpc="http://schemas.microsoft.com/office/word/2010/wordprocessingCanvas" xmlns:cx="http://schemas.microsoft.com/office/drawing/2014/chartex" xmlns:cx1="http://schemas.microsoft.com/office/drawing/2015/9/8/chartex" xmlns:cx2="http://schemas.microsoft.com/office/drawing/2015/10/21/chartex" xmlns:cx3="http://schemas.microsoft.com/office/drawing/2016/5/9/chartex" xmlns:cx4="http://schemas.microsoft.com/office/drawing/2016/5/10/chartex" xmlns:cx5="http://schemas.microsoft.com/office/drawing/2016/5/11/chartex" xmlns:cx6="http://schemas.microsoft.com/office/drawing/2016/5/12/chartex" xmlns:cx7="http://schemas.microsoft.com/office/drawing/2016/5/13/chartex" xmlns:cx8="http://schemas.microsoft.com/office/drawing/2016/5/14/chartex" xmlns:mc="http://schemas.openxmlformats.org/markup-compatibility/2006" xmlns:aink="http://schemas.microsoft.com/office/drawing/2016/ink" xmlns:am3d="http://schemas.microsoft.com/office/drawing/2017/model3d" xmlns:o="urn:schemas-microsoft-com:office:office" xmlns:oel="http://schemas.microsoft.com/office/2019/extlst" xmlns:r="http://schemas.openxmlformats.org/officeDocument/2006/relationships" xmlns:m="http://schemas.openxmlformats.org/officeDocument/2006/math" xmlns:v="urn:schemas-microsoft-com:vml" xmlns:wp14="http://schemas.microsoft.com/office/word/2010/wordprocessingDrawing" xmlns:wp="http://schemas.openxmlformats.org/drawingml/2006/wordprocessingDrawing" xmlns:w10="urn:schemas-microsoft-com:office:word" xmlns:w="http://schemas.openxmlformats.org/wordprocessingml/2006/main" xmlns:w14="http://schemas.microsoft.com/office/word/2010/wordml" xmlns:w15="http://schemas.microsoft.com/office/word/2012/wordml" xmlns:w16cex="http://schemas.microsoft.com/office/word/2018/wordml/cex" xmlns:w16cid="http://schemas.microsoft.com/office/word/2016/wordml/cid" xmlns:w16="http://schemas.microsoft.com/office/word/2018/wordml" xmlns:w16du="http://schemas.microsoft.com/office/word/2023/wordml/word16du" xmlns:w16sdtdh="http://schemas.microsoft.com/office/word/2020/wordml/sdtdatahash" xmlns:w16sdtfl="http://schemas.microsoft.com/office/word/2024/wordml/sdtformatlock" xmlns:w16se="http://schemas.microsoft.com/office/word/2015/wordml/symex" xmlns:wpg="http://schemas.microsoft.com/office/word/2010/wordprocessingGroup" xmlns:wpi="http://schemas.microsoft.com/office/word/2010/wordprocessingInk" xmlns:wne="http://schemas.microsoft.com/office/word/2006/wordml" xmlns:wps="http://schemas.microsoft.com/office/word/2010/wordprocessingShape" mc:Ignorable="w14 w15 w16se w16cid w16 w16cex w16sdtdh w16sdtfl w16du wp14">
+  <w:p>
+    <w:pPr>
+      <w:pStyle w:val="Footer"/>
+    </w:pPr>
+  </w:p>
+</w:ftr>
+</file>
+
 <file path=word/footnotes.xml><?xml version="1.0" encoding="utf-8"?>
 <w:footnotes xmlns:wpc="http://schemas.microsoft.com/office/word/2010/wordprocessingCanvas" xmlns:cx="http://schemas.microsoft.com/office/drawing/2014/chartex" xmlns:cx1="http://schemas.microsoft.com/office/drawing/2015/9/8/chartex" xmlns:cx2="http://schemas.microsoft.com/office/drawing/2015/10/21/chartex" xmlns:cx3="http://schemas.microsoft.com/office/drawing/2016/5/9/chartex" xmlns:cx4="http://schemas.microsoft.com/office/drawing/2016/5/10/chartex" xmlns:cx5="http://schemas.microsoft.com/office/drawing/2016/5/11/chartex" xmlns:cx6="http://schemas.microsoft.com/office/drawing/2016/5/12/chartex" xmlns:cx7="http://schemas.microsoft.com/office/drawing/2016/5/13/chartex" xmlns:cx8="http://schemas.microsoft.com/office/drawing/2016/5/14/chartex" xmlns:mc="http://schemas.openxmlformats.org/markup-compatibility/2006" xmlns:aink="http://schemas.microsoft.com/office/drawing/2016/ink" xmlns:am3d="http://schemas.microsoft.com/office/drawing/2017/model3d" xmlns:o="urn:schemas-microsoft-com:office:office" xmlns:oel="http://schemas.microsoft.com/office/2019/extlst" xmlns:r="http://schemas.openxmlformats.org/officeDocument/2006/relationships" xmlns:m="http://schemas.openxmlformats.org/officeDocument/2006/math" xmlns:v="urn:schemas-microsoft-com:vml" xmlns:wp14="http://schemas.microsoft.com/office/word/2010/wordprocessingDrawing" xmlns:wp="http://schemas.openxmlformats.org/drawingml/2006/wordprocessingDrawing" xmlns:w10="urn:schemas-microsoft-com:office:word" xmlns:w="http://schemas.openxmlformats.org/wordprocessingml/2006/main" xmlns:w14="http://schemas.microsoft.com/office/word/2010/wordml" xmlns:w15="http://schemas.microsoft.com/office/word/2012/wordml" xmlns:w16cex="http://schemas.microsoft.com/office/word/2018/wordml/cex" xmlns:w16cid="http://schemas.microsoft.com/office/word/2016/wordml/cid" xmlns:w16="http://schemas.microsoft.com/office/word/2018/wordml" xmlns:w16du="http://schemas.microsoft.com/office/word/2023/wordml/word16du" xmlns:w16sdtdh="http://schemas.microsoft.com/office/word/2020/wordml/sdtdatahash" xmlns:w16sdtfl="http://schemas.microsoft.com/office/word/2024/wordml/sdtformatlock" xmlns:w16se="http://schemas.microsoft.com/office/word/2015/wordml/symex" xmlns:wpg="http://schemas.microsoft.com/office/word/2010/wordprocessingGroup" xmlns:wpi="http://schemas.microsoft.com/office/word/2010/wordprocessingInk" xmlns:wne="http://schemas.microsoft.com/office/word/2006/wordml" xmlns:wps="http://schemas.microsoft.com/office/word/2010/wordprocessingShape" mc:Ignorable="w14 w15 w16se w16cid w16 w16cex w16sdtdh w16sdtfl w16du wp14">
   <w:footnote w:type="separator" w:id="-1">
@@ -78,27 +113,37 @@
     <w:pPr>
       <w:pStyle w:val="Header"/>
     </w:pPr>
+  </w:p>
+</w:hdr>
+</file>
+
+<file path=word/header2.xml><?xml version="1.0" encoding="utf-8"?>
+<w:hdr xmlns:wpc="http://schemas.microsoft.com/office/word/2010/wordprocessingCanvas" xmlns:cx="http://schemas.microsoft.com/office/drawing/2014/chartex" xmlns:cx1="http://schemas.microsoft.com/office/drawing/2015/9/8/chartex" xmlns:cx2="http://schemas.microsoft.com/office/drawing/2015/10/21/chartex" xmlns:cx3="http://schemas.microsoft.com/office/drawing/2016/5/9/chartex" xmlns:cx4="http://schemas.microsoft.com/office/drawing/2016/5/10/chartex" xmlns:cx5="http://schemas.microsoft.com/office/drawing/2016/5/11/chartex" xmlns:cx6="http://schemas.microsoft.com/office/drawing/2016/5/12/chartex" xmlns:cx7="http://schemas.microsoft.com/office/drawing/2016/5/13/chartex" xmlns:cx8="http://schemas.microsoft.com/office/drawing/2016/5/14/chartex" xmlns:mc="http://schemas.openxmlformats.org/markup-compatibility/2006" xmlns:aink="http://schemas.microsoft.com/office/drawing/2016/ink" xmlns:am3d="http://schemas.microsoft.com/office/drawing/2017/model3d" xmlns:o="urn:schemas-microsoft-com:office:office" xmlns:oel="http://schemas.microsoft.com/office/2019/extlst" xmlns:r="http://schemas.openxmlformats.org/officeDocument/2006/relationships" xmlns:m="http://schemas.openxmlformats.org/officeDocument/2006/math" xmlns:v="urn:schemas-microsoft-com:vml" xmlns:wp14="http://schemas.microsoft.com/office/word/2010/wordprocessingDrawing" xmlns:wp="http://schemas.openxmlformats.org/drawingml/2006/wordprocessingDrawing" xmlns:w10="urn:schemas-microsoft-com:office:word" xmlns:w="http://schemas.openxmlformats.org/wordprocessingml/2006/main" xmlns:w14="http://schemas.microsoft.com/office/word/2010/wordml" xmlns:w15="http://schemas.microsoft.com/office/word/2012/wordml" xmlns:w16cex="http://schemas.microsoft.com/office/word/2018/wordml/cex" xmlns:w16cid="http://schemas.microsoft.com/office/word/2016/wordml/cid" xmlns:w16="http://schemas.microsoft.com/office/word/2018/wordml" xmlns:w16du="http://schemas.microsoft.com/office/word/2023/wordml/word16du" xmlns:w16sdtdh="http://schemas.microsoft.com/office/word/2020/wordml/sdtdatahash" xmlns:w16sdtfl="http://schemas.microsoft.com/office/word/2024/wordml/sdtformatlock" xmlns:w16se="http://schemas.microsoft.com/office/word/2015/wordml/symex" xmlns:wpg="http://schemas.microsoft.com/office/word/2010/wordprocessingGroup" xmlns:wpi="http://schemas.microsoft.com/office/word/2010/wordprocessingInk" xmlns:wne="http://schemas.microsoft.com/office/word/2006/wordml" xmlns:wps="http://schemas.microsoft.com/office/word/2010/wordprocessingShape" mc:Ignorable="w14 w15 w16se w16cid w16 w16cex w16sdtdh w16sdtfl w16du wp14">
+  <w:p>
+    <w:pPr>
+      <w:pStyle w:val="Header"/>
+    </w:pPr>
     <w:r>
       <w:rPr>
         <w:noProof/>
       </w:rPr>
       <w:drawing>
-        <wp:anchor distT="0" distB="0" distL="114300" distR="114300" simplePos="0" relativeHeight="251658240" behindDoc="1" locked="0" layoutInCell="1" allowOverlap="1" wp14:anchorId="34129EB8" wp14:editId="5A2A1565">
+        <wp:anchor distT="0" distB="0" distL="114300" distR="114300" simplePos="0" relativeHeight="251658240" behindDoc="1" locked="0" layoutInCell="1" allowOverlap="1" wp14:anchorId="34129EB8" wp14:editId="550424C8">
           <wp:simplePos x="0" y="0"/>
           <wp:positionH relativeFrom="page">
-            <wp:align>left</wp:align>
+            <wp:align>right</wp:align>
           </wp:positionH>
           <wp:positionV relativeFrom="paragraph">
             <wp:posOffset>-466725</wp:posOffset>
           </wp:positionV>
-          <wp:extent cx="7560310" cy="1228725"/>
-          <wp:effectExtent l="0" t="0" r="2540" b="9525"/>
+          <wp:extent cx="7553325" cy="1228725"/>
+          <wp:effectExtent l="0" t="0" r="9525" b="9525"/>
           <wp:wrapTight wrapText="bothSides">
             <wp:wrapPolygon edited="0">
               <wp:start x="0" y="0"/>
               <wp:lineTo x="0" y="21433"/>
-              <wp:lineTo x="21553" y="21433"/>
-              <wp:lineTo x="21553" y="0"/>
+              <wp:lineTo x="21573" y="21433"/>
+              <wp:lineTo x="21573" y="0"/>
               <wp:lineTo x="0" y="0"/>
             </wp:wrapPolygon>
           </wp:wrapTight>
@@ -128,7 +173,7 @@
                 <pic:spPr>
                   <a:xfrm>
                     <a:off x="0" y="0"/>
-                    <a:ext cx="7560310" cy="1228725"/>
+                    <a:ext cx="7553325" cy="1228725"/>
                   </a:xfrm>
                   <a:prstGeom prst="rect">
                     <a:avLst/>
@@ -146,6 +191,16 @@
         </wp:anchor>
       </w:drawing>
     </w:r>
+  </w:p>
+</w:hdr>
+</file>
+
+<file path=word/header3.xml><?xml version="1.0" encoding="utf-8"?>
+<w:hdr xmlns:wpc="http://schemas.microsoft.com/office/word/2010/wordprocessingCanvas" xmlns:cx="http://schemas.microsoft.com/office/drawing/2014/chartex" xmlns:cx1="http://schemas.microsoft.com/office/drawing/2015/9/8/chartex" xmlns:cx2="http://schemas.microsoft.com/office/drawing/2015/10/21/chartex" xmlns:cx3="http://schemas.microsoft.com/office/drawing/2016/5/9/chartex" xmlns:cx4="http://schemas.microsoft.com/office/drawing/2016/5/10/chartex" xmlns:cx5="http://schemas.microsoft.com/office/drawing/2016/5/11/chartex" xmlns:cx6="http://schemas.microsoft.com/office/drawing/2016/5/12/chartex" xmlns:cx7="http://schemas.microsoft.com/office/drawing/2016/5/13/chartex" xmlns:cx8="http://schemas.microsoft.com/office/drawing/2016/5/14/chartex" xmlns:mc="http://schemas.openxmlformats.org/markup-compatibility/2006" xmlns:aink="http://schemas.microsoft.com/office/drawing/2016/ink" xmlns:am3d="http://schemas.microsoft.com/office/drawing/2017/model3d" xmlns:o="urn:schemas-microsoft-com:office:office" xmlns:oel="http://schemas.microsoft.com/office/2019/extlst" xmlns:r="http://schemas.openxmlformats.org/officeDocument/2006/relationships" xmlns:m="http://schemas.openxmlformats.org/officeDocument/2006/math" xmlns:v="urn:schemas-microsoft-com:vml" xmlns:wp14="http://schemas.microsoft.com/office/word/2010/wordprocessingDrawing" xmlns:wp="http://schemas.openxmlformats.org/drawingml/2006/wordprocessingDrawing" xmlns:w10="urn:schemas-microsoft-com:office:word" xmlns:w="http://schemas.openxmlformats.org/wordprocessingml/2006/main" xmlns:w14="http://schemas.microsoft.com/office/word/2010/wordml" xmlns:w15="http://schemas.microsoft.com/office/word/2012/wordml" xmlns:w16cex="http://schemas.microsoft.com/office/word/2018/wordml/cex" xmlns:w16cid="http://schemas.microsoft.com/office/word/2016/wordml/cid" xmlns:w16="http://schemas.microsoft.com/office/word/2018/wordml" xmlns:w16du="http://schemas.microsoft.com/office/word/2023/wordml/word16du" xmlns:w16sdtdh="http://schemas.microsoft.com/office/word/2020/wordml/sdtdatahash" xmlns:w16sdtfl="http://schemas.microsoft.com/office/word/2024/wordml/sdtformatlock" xmlns:w16se="http://schemas.microsoft.com/office/word/2015/wordml/symex" xmlns:wpg="http://schemas.microsoft.com/office/word/2010/wordprocessingGroup" xmlns:wpi="http://schemas.microsoft.com/office/word/2010/wordprocessingInk" xmlns:wne="http://schemas.microsoft.com/office/word/2006/wordml" xmlns:wps="http://schemas.microsoft.com/office/word/2010/wordprocessingShape" mc:Ignorable="w14 w15 w16se w16cid w16 w16cex w16sdtdh w16sdtfl w16du wp14">
+  <w:p>
+    <w:pPr>
+      <w:pStyle w:val="Header"/>
+    </w:pPr>
   </w:p>
 </w:hdr>
 </file>

</xml_diff>